<commit_message>
Denklem atıflarını ve simge listesini tamamla
Denetimde iki eksik çıktı. On bir denklemin yalnızca ikisi metinde
anılıyordu; dergi kuralı denklemlerin Eş. biçiminde anılmasını istiyor.
Hepsine metin içinden atıf verildi.

Simge listesinde şartlandırılmış döşeme alanı, kullanım alanı ve sıcaklık
listelenmiş ama metinde hiç kullanılmamıştı. Üçü de geçtikleri yerlerde
simgeleriyle yazıldı; liste ile metin artık birebir örtüşüyor.

Co-Authored-By: Claude Opus 5 <noreply@anthropic.com>
Claude-Session: https://claude.ai/code/session_01PXNr6B5ub9HQiGgT1W1jpd
</commit_message>
<xml_diff>
--- a/biyotasarim makale/basvuru/01-makale-metni.docx
+++ b/biyotasarim makale/basvuru/01-makale-metni.docx
@@ -1072,7 +1072,7 @@
           <w:sz w:val="18"/>
           <w:szCs w:val="18"/>
         </w:rPr>
-        <w:t xml:space="preserve">Karşılaştırma birimi, TS 825:2024'ün ilgili derece gün bölgesi için tavsiye ettiği ısıl geçirgenlik değerini sağlayan 1 m² dış duvar bileşenidir. Malzemeleri doğrudan ısı iletkenlik katsayısına göre karşılaştırmak yanıltıcı olur; eşdeğer ısıl performans koşulu her malzemenin farklı kalınlıkta kullanılmasını gerektirir ve bu fark kütleye, gömülü karbona ve gerekli duvar kalınlığına yansır. Toplam ısıl direnç, yalıtım katmanı ile diğer katmanların ve yüzeysel dirençlerin toplamıdır:</w:t>
+        <w:t xml:space="preserve">Karşılaştırma birimi, TS 825:2024'ün ilgili derece gün bölgesi için tavsiye ettiği ısıl geçirgenlik değerini sağlayan 1 m² dış duvar bileşenidir. Malzemeleri doğrudan ısı iletkenlik katsayısına göre karşılaştırmak yanıltıcı olur; eşdeğer ısıl performans koşulu her malzemenin farklı kalınlıkta kullanılmasını gerektirir ve bu fark kütleye, gömülü karbona ve gerekli duvar kalınlığına yansır. Toplam ısıl direnç, yalıtım katmanı ile diğer katmanların ve yüzeysel dirençlerin toplamıdır (Eş. 1):</w:t>
       </w:r>
     </w:p>
     <w:p>
@@ -1142,7 +1142,7 @@
           <w:sz w:val="18"/>
           <w:szCs w:val="18"/>
         </w:rPr>
-        <w:t xml:space="preserve">Buradan, b bölgesinde m malzemesi için gereken yalıtım kalınlığı:</w:t>
+        <w:t xml:space="preserve">Eş. 1'den, b bölgesinde m malzemesi için gereken yalıtım kalınlığı Eş. 2 ile elde edilir:</w:t>
       </w:r>
     </w:p>
     <w:p>
@@ -1294,7 +1294,7 @@
           <w:sz w:val="18"/>
           <w:szCs w:val="18"/>
         </w:rPr>
-        <w:t xml:space="preserve">Kalınlıktan türeyen büyüklüklerin tamamı ortak K_b çarpanını taşır: birim kütle λρK_b, gömülü karbon λρεK_b, alansal ısıl kapasite λρcK_b ve gerekli yalıtım kalınlığı λK_b biçimindedir. Geriye kalan ölçütler malzeme özellikleridir ve bölgeye göre değişmez. TOPSIS'in vektörel normalizasyonunda j sütunu için:</w:t>
+        <w:t xml:space="preserve">Kalınlıktan türeyen büyüklüklerin tamamı ortak K_b çarpanını taşır: birim kütle λρK_b, gömülü karbon λρεK_b, alansal ısıl kapasite λρcK_b ve gerekli yalıtım kalınlığı λK_b biçimindedir. Geriye kalan ölçütler malzeme özellikleridir ve bölgeye göre değişmez. TOPSIS'in vektörel normalizasyonunda j sütunu için Eş. 3 yazılır:</w:t>
       </w:r>
     </w:p>
     <w:p>
@@ -1364,7 +1364,7 @@
           <w:sz w:val="18"/>
           <w:szCs w:val="18"/>
         </w:rPr>
-        <w:t xml:space="preserve">K_b tam olarak sadeleşir ve normalize matris bölgeden bağımsız hâle gelir. Aynı sadeleşme VIKOR'un min-maks normalizasyonunda ve entropi ile CRITIC'in dayandığı normalize sütun istatistiklerinde de gerçekleşir; dolayısıyla ağırlıklar da bölgeye göre değişmez.</w:t>
+        <w:t xml:space="preserve">Eş. 3'te K_b tam olarak sadeleşir ve normalize matris bölgeden bağımsız hâle gelir. Aynı sadeleşme VIKOR'un min-maks normalizasyonunda ve entropi ile CRITIC'in dayandığı normalize sütun istatistiklerinde de gerçekleşir; dolayısıyla ağırlıklar da bölgeye göre değişmez.</w:t>
       </w:r>
     </w:p>
     <w:p>
@@ -13018,7 +13018,7 @@
           <w:sz w:val="18"/>
           <w:szCs w:val="18"/>
         </w:rPr>
-        <w:t xml:space="preserve">Her bölge için ısıtma derece günü (IDG) ve soğutma derece günü (SDG) hesaplanmış, soğutma payı σ_b = SDG/(IDG+SDG) olarak tanımlanmıştır. Isıtma tabanı 20 °C, soğutma tabanı 22 °C alınmıştır; 26 °C tasarım sıcaklığı aylık ortalamalarla birlikte kullanıldığında Türkiye'de nadiren aşıldığından anlamlı bir gradyan üretmemektedir.</w:t>
+        <w:t xml:space="preserve">Her bölge için ısıtma derece günü (IDG) ve soğutma derece günü (SDG) hesaplanmış, soğutma payı σ_b = SDG/(IDG+SDG) olarak tanımlanmıştır. Isıtma taban sıcaklığı θ = 20 °C, soğutma taban sıcaklığı θ = 22 °C alınmıştır; 26 °C tasarım sıcaklığı aylık ortalamalarla birlikte kullanıldığında Türkiye'de nadiren aşıldığından anlamlı bir gradyan üretmemektedir.</w:t>
       </w:r>
     </w:p>
     <w:p>
@@ -13100,7 +13100,7 @@
           <w:sz w:val="18"/>
           <w:szCs w:val="18"/>
         </w:rPr>
-        <w:t xml:space="preserve">Üç objektif ağırlıklandırma yöntemi karşılaştırmalı olarak kullanılmıştır. Birincisinde ağırlık, bir sütunun taşıdığı bilginin ölçüsü olan Shannon entropisinden türetilir; bir sütunun entropisi bire ne kadar uzaksa ağırlığı o kadar büyür:</w:t>
+        <w:t xml:space="preserve">Üç objektif ağırlıklandırma yöntemi karşılaştırmalı olarak kullanılmıştır. Birincisinde ağırlık, bir sütunun taşıdığı bilginin ölçüsü olan Shannon entropisinden türetilir; bir sütunun entropisi bire ne kadar uzaksa ağırlığı o kadar büyür (Eş. 4):</w:t>
       </w:r>
     </w:p>
     <w:p>
@@ -13170,7 +13170,7 @@
           <w:sz w:val="18"/>
           <w:szCs w:val="18"/>
         </w:rPr>
-        <w:t xml:space="preserve">Burada p_{mj} normalize matriste m alternatifinin j sütunu içindeki payı, n ise alternatif sayısıdır. İkinci yöntemde ağırlık, sütunun standart sapması sd_j ile o sütunun diğer sütunlarla çelişme miktarının çarpımından gelir:</w:t>
+        <w:t xml:space="preserve">Burada p_{mj} normalize matriste m alternatifinin j sütunu içindeki payı, n ise alternatif sayısıdır. İkinci yöntemde ağırlık, sütunun standart sapması sd_j ile o sütunun diğer sütunlarla çelişme miktarının çarpımından gelir (Eş. 5):</w:t>
       </w:r>
     </w:p>
     <w:p>
@@ -13240,7 +13240,7 @@
           <w:sz w:val="18"/>
           <w:szCs w:val="18"/>
         </w:rPr>
-        <w:t xml:space="preserve">Bu ölçü, yayılımı yüksek olmakla birlikte başka bir ölçütle güçlü ilişkili olan sütunların payını sınırlar [29]. Üçüncüsü w_j = 1/m ile tanımlı eşit ağırlıktır ve kontrol kurgusu olarak yer alır. Uzman anketine dayalı subjektif ağırlıklandırma, sonucun yanıt havuzuna bağımlı hâle gelmesini önlemek ve hesabın bağımsız olarak yinelenebilmesini korumak amacıyla bilinçli olarak dışarıda bırakılmıştır.</w:t>
+        <w:t xml:space="preserve">Eş. 5'teki bu ölçü, yayılımı yüksek olmakla birlikte başka bir ölçütle güçlü ilişkili olan sütunların payını sınırlar [29]. Üçüncüsü w_j = 1/m ile tanımlı eşit ağırlıktır ve kontrol kurgusu olarak yer alır. Uzman anketine dayalı subjektif ağırlıklandırma, sonucun yanıt havuzuna bağımlı hâle gelmesini önlemek ve hesabın bağımsız olarak yinelenebilmesini korumak amacıyla bilinçli olarak dışarıda bırakılmıştır.</w:t>
       </w:r>
     </w:p>
     <w:p>
@@ -13427,7 +13427,7 @@
           <w:sz w:val="18"/>
           <w:szCs w:val="18"/>
         </w:rPr>
-        <w:t xml:space="preserve">TOPSIS birincil yöntemdir. Ağırlıklı normalize matriste her alternatifin ideal ve negatif ideal çözüme Öklid uzaklıkları (d⁺_m ve d⁻_m) hesaplanır; alternatifin puanı bu iki uzaklığın oranından gelir [33]:</w:t>
+        <w:t xml:space="preserve">TOPSIS birincil yöntemdir. Ağırlıklı normalize matriste her alternatifin ideal ve negatif ideal çözüme Öklid uzaklıkları (d⁺_m ve d⁻_m) hesaplanır; alternatifin puanı bu iki uzaklığın oranından gelir (Eş. 7) [33]:</w:t>
       </w:r>
     </w:p>
     <w:p>
@@ -13836,7 +13836,7 @@
           <w:sz w:val="18"/>
           <w:szCs w:val="18"/>
         </w:rPr>
-        <w:t xml:space="preserve">Doğrulama adımı, tam tanımlı temsili bir referans konut üzerinde yürütülmüştür: 24,0 × 12,0 m plan, beş kat, 2,80 m kat yüksekliği, 4032 m³ brüt hacim, 1440 m² şartlandırılmış döşeme alanı, 1290,2 m² kullanım alanı, 184,8 m² pencere alanı (güneyde duvar alanının %25'i, diğer yönlerde %15'i) ve 0,393 A/V oranı. Binanın özgül ısı kaybı, iletim ve havalandırma bileşenlerinin toplamıdır:</w:t>
+        <w:t xml:space="preserve">Doğrulama adımı, tam tanımlı temsili bir referans konut üzerinde yürütülmüştür: 24,0 × 12,0 m plan, beş kat, 2,80 m kat yüksekliği, 4032 m³ brüt hacim, A_f = 1440 m² şartlandırılmış döşeme alanı, A_n = 1290,2 m² kullanım alanı, 184,8 m² pencere alanı (güneyde duvar alanının %25'i, diğer yönlerde %15'i) ve 0,393 A/V oranı. Binanın özgül ısı kaybı, iletim ve havalandırma bileşenlerinin toplamıdır (Eş. 8):</w:t>
       </w:r>
     </w:p>
     <w:p>
@@ -13906,7 +13906,7 @@
           <w:sz w:val="18"/>
           <w:szCs w:val="18"/>
         </w:rPr>
-        <w:t xml:space="preserve">İletim bileşeni, kabuğu oluşturan yüzeylerin ısıl geçirgenlik-alan çarpımlarından; çatı ve taban için sıcaklık düzeltme çarpanlarıyla birlikte kurulur:</w:t>
+        <w:t xml:space="preserve">İletim bileşeni, kabuğu oluşturan yüzeylerin ısıl geçirgenlik-alan çarpımlarından; çatı ve taban için sıcaklık düzeltme çarpanlarıyla birlikte kurulur (Eş. 9):</w:t>
       </w:r>
     </w:p>
     <w:p>
@@ -13976,7 +13976,7 @@
           <w:sz w:val="18"/>
           <w:szCs w:val="18"/>
         </w:rPr>
-        <w:t xml:space="preserve">Havalandırma bileşeni ise havalandırılan hacim üzerinden yazılır:</w:t>
+        <w:t xml:space="preserve">Havalandırma bileşeni ise havalandırılan hacim üzerinden yazılır (Eş. 10):</w:t>
       </w:r>
     </w:p>
     <w:p>
@@ -14081,7 +14081,7 @@
           <w:sz w:val="18"/>
           <w:szCs w:val="18"/>
         </w:rPr>
-        <w:t xml:space="preserve">İç kazançlar 5 W/m² × kullanım alanı, güneş kazançları ise dört yönün pencere alanları üzerinden gölgelenme faktörü 0,6 ve güneş geçirme faktörü 0,6 ile hesaplanmıştır. Duvar yalıtımının etkin ısıl kapasitesine katkısı λρcK_b × opak alan biçiminde, döşeme ve iç duvarların katkısı ise 150 kJ/m²K × döşeme alanı kabulüyle hesaplanmıştır.</w:t>
+        <w:t xml:space="preserve">İç kazançlar 5 W/m² × A_n, güneş kazançları ise dört yönün pencere alanları üzerinden gölgelenme faktörü 0,6 ve güneş geçirme faktörü 0,6 ile hesaplanmıştır. Duvar yalıtımının etkin ısıl kapasitesine katkısı λρcK_b × opak alan biçiminde, döşeme ve iç duvarların katkısı ise 150 kJ/m²K × döşeme alanı kabulüyle hesaplanmıştır.</w:t>
       </w:r>
     </w:p>
     <w:p>
@@ -14151,7 +14151,7 @@
           <w:sz w:val="18"/>
           <w:szCs w:val="18"/>
         </w:rPr>
-        <w:t xml:space="preserve">Fonksiyonel birim sabit U hedefine dayandığı için yalıtım malzemesi değiştiğinde H değişmez; malzemenin yıllık enerjiye etki edebileceği tek yol ısıl kütlesi C üzerinden kullanım faktörüdür. Bu nedenle iki kurgu karşılaştırılmıştır. Kurgu A'da kullanım faktörü yalnızca kazanç-kayıp oranına bağlıdır ve zaman sabitinden bağımsızdır. Kurgu B'de kullanım faktörü, kazanç-kayıp oranı γ ile binanın zaman sabitine birlikte bağlıdır:</w:t>
+        <w:t xml:space="preserve">Fonksiyonel birim sabit U hedefine dayandığı için yalıtım malzemesi değiştiğinde H değişmez; malzemenin yıllık enerjiye etki edebileceği tek yol ısıl kütlesi C üzerinden kullanım faktörüdür. Bu nedenle iki kurgu karşılaştırılmıştır. Kurgu A'da kullanım faktörü yalnızca kazanç-kayıp oranına bağlıdır ve zaman sabitinden bağımsızdır. Kurgu B'de kullanım faktörü, kazanç-kayıp oranı γ ile binanın zaman sabitine birlikte bağlıdır (Eş. 11):</w:t>
       </w:r>
     </w:p>
     <w:p>

</xml_diff>